<commit_message>
feat: Soporte de la metodologia de desarrollo
</commit_message>
<xml_diff>
--- a/Requerimientos funcionales y no funcionales.docx
+++ b/Requerimientos funcionales y no funcionales.docx
@@ -1039,40 +1039,16 @@
         <w:t>ebe permitir el registro y mantenimiento de entidades como: Tipo de Brecha, Tipo de Proyecto,</w:t>
       </w:r>
       <w:r>
-        <w:t> Procesos Corregidos</w:t>
-      </w:r>
-      <w:r>
-        <w:t xml:space="preserve">, </w:t>
-      </w:r>
-      <w:r>
-        <w:t>Procesos Realizados</w:t>
-      </w:r>
-      <w:r>
-        <w:t xml:space="preserve">, </w:t>
+        <w:t xml:space="preserve"> Procesos Corregidos, Procesos Realizados, </w:t>
       </w:r>
       <w:r>
         <w:t xml:space="preserve">Investigadores, Empresas, </w:t>
       </w:r>
       <w:r>
-        <w:t>Subtipo de Ficha</w:t>
-      </w:r>
-      <w:r>
-        <w:t xml:space="preserve">, </w:t>
-      </w:r>
-      <w:r>
-        <w:t>Tipo de Irregularidad</w:t>
-      </w:r>
-      <w:r>
-        <w:t xml:space="preserve">, </w:t>
-      </w:r>
-      <w:r>
-        <w:t>Subtipo de Irregularidad</w:t>
-      </w:r>
-      <w:r>
-        <w:t xml:space="preserve"> y </w:t>
-      </w:r>
-      <w:r>
-        <w:t>Procedencia Casos</w:t>
+        <w:t>Subtipo de Ficha, Tipo de Irregularidad</w:t>
+      </w:r>
+      <w:r>
+        <w:t>, Subtipo de Irregularidad y Procedencia Casos</w:t>
       </w:r>
       <w:r>
         <w:t>.</w:t>
@@ -1087,7 +1063,13 @@
         </w:numPr>
       </w:pPr>
       <w:r>
-        <w:t>RF12 - Marcación de archivos: el sistema debe permitir la marcación de archivos como: archivos negados.</w:t>
+        <w:t xml:space="preserve">RF12 - Marcación de archivos: el sistema debe permitir la marcación de archivos como: </w:t>
+      </w:r>
+      <w:r>
+        <w:t>A</w:t>
+      </w:r>
+      <w:r>
+        <w:t>rchivos negados.</w:t>
       </w:r>
     </w:p>
     <w:p>
@@ -1177,7 +1159,7 @@
         <w:t xml:space="preserve"> con opciones de ordenamiento </w:t>
       </w:r>
       <w:r>
-        <w:t>por antigüedad (forma creciente o decreciente)</w:t>
+        <w:t>por antigüedad</w:t>
       </w:r>
       <w:r>
         <w:t>.</w:t>
@@ -1196,10 +1178,7 @@
       <w:bookmarkStart w:id="1" w:name="_Toc220174132"/>
       <w:r>
         <w:lastRenderedPageBreak/>
-        <w:t xml:space="preserve">Requisitos </w:t>
-      </w:r>
-      <w:r>
-        <w:t>no funcionales</w:t>
+        <w:t>Requisitos no funcionales</w:t>
       </w:r>
       <w:bookmarkEnd w:id="1"/>
     </w:p>
@@ -1311,25 +1290,37 @@
         </w:numPr>
       </w:pPr>
       <w:r>
-        <w:t xml:space="preserve">RNF04 - Metodología de </w:t>
-      </w:r>
-      <w:r>
-        <w:t>d</w:t>
-      </w:r>
-      <w:r>
-        <w:t xml:space="preserve">esarrollo: </w:t>
+        <w:t>RNF0</w:t>
+      </w:r>
+      <w:r>
+        <w:t>4</w:t>
+      </w:r>
+      <w:r>
+        <w:t xml:space="preserve"> - Organización del </w:t>
       </w:r>
       <w:r>
         <w:t>e</w:t>
       </w:r>
       <w:r>
-        <w:t xml:space="preserve">l proyecto debe seguir y documentar una metodología de desarrollo </w:t>
-      </w:r>
-      <w:r>
-        <w:t xml:space="preserve">rigurosa y formal </w:t>
-      </w:r>
-      <w:r>
-        <w:t>vista en clase.</w:t>
+        <w:t xml:space="preserve">quipo: </w:t>
+      </w:r>
+      <w:r>
+        <w:t>e</w:t>
+      </w:r>
+      <w:r>
+        <w:t xml:space="preserve">l proyecto debe ser realizado estrictamente </w:t>
+      </w:r>
+      <w:r>
+        <w:t>por un equipo</w:t>
+      </w:r>
+      <w:r>
+        <w:t xml:space="preserve"> de </w:t>
+      </w:r>
+      <w:r>
+        <w:t>dos</w:t>
+      </w:r>
+      <w:r>
+        <w:t xml:space="preserve"> personas.</w:t>
       </w:r>
     </w:p>
     <w:p>
@@ -1341,43 +1332,31 @@
         </w:numPr>
       </w:pPr>
       <w:r>
-        <w:t xml:space="preserve">RNF05 - Restricciones de </w:t>
-      </w:r>
-      <w:r>
-        <w:t>i</w:t>
-      </w:r>
-      <w:r>
-        <w:t xml:space="preserve">mplementación: </w:t>
+        <w:t>RNF0</w:t>
+      </w:r>
+      <w:r>
+        <w:t>5</w:t>
+      </w:r>
+      <w:r>
+        <w:t xml:space="preserve"> - Metodología de </w:t>
+      </w:r>
+      <w:r>
+        <w:t>d</w:t>
+      </w:r>
+      <w:r>
+        <w:t xml:space="preserve">esarrollo: </w:t>
       </w:r>
       <w:r>
         <w:t>e</w:t>
       </w:r>
       <w:r>
-        <w:t xml:space="preserve">l </w:t>
-      </w:r>
-      <w:r>
-        <w:t>desarrollo debe incluir</w:t>
-      </w:r>
-      <w:r>
-        <w:t xml:space="preserve"> </w:t>
-      </w:r>
-      <w:r>
-        <w:t>p</w:t>
-      </w:r>
-      <w:r>
-        <w:t xml:space="preserve">atrones de </w:t>
-      </w:r>
-      <w:r>
-        <w:t>d</w:t>
-      </w:r>
-      <w:r>
-        <w:t xml:space="preserve">iseño vistos </w:t>
-      </w:r>
-      <w:r>
-        <w:t>en clase</w:t>
-      </w:r>
-      <w:r>
-        <w:t>.</w:t>
+        <w:t xml:space="preserve">l proyecto debe seguir y documentar una metodología de desarrollo </w:t>
+      </w:r>
+      <w:r>
+        <w:t xml:space="preserve">rigurosa y formal </w:t>
+      </w:r>
+      <w:r>
+        <w:t>vista en clase.</w:t>
       </w:r>
     </w:p>
     <w:p>
@@ -1389,31 +1368,106 @@
         </w:numPr>
       </w:pPr>
       <w:r>
-        <w:t xml:space="preserve">RNF06 - Organización del </w:t>
+        <w:t>RNF0</w:t>
+      </w:r>
+      <w:r>
+        <w:t>6</w:t>
+      </w:r>
+      <w:r>
+        <w:t xml:space="preserve"> </w:t>
+      </w:r>
+      <w:r>
+        <w:t>-</w:t>
+      </w:r>
+      <w:r>
+        <w:t xml:space="preserve"> </w:t>
+      </w:r>
+      <w:r>
+        <w:t>Patrones de diseño</w:t>
+      </w:r>
+      <w:r>
+        <w:t xml:space="preserve">: </w:t>
       </w:r>
       <w:r>
         <w:t>e</w:t>
       </w:r>
       <w:r>
-        <w:t xml:space="preserve">quipo: </w:t>
-      </w:r>
-      <w:r>
-        <w:t>e</w:t>
-      </w:r>
-      <w:r>
-        <w:t xml:space="preserve">l proyecto debe ser realizado estrictamente </w:t>
-      </w:r>
-      <w:r>
-        <w:t>por un equipo</w:t>
-      </w:r>
-      <w:r>
-        <w:t xml:space="preserve"> de </w:t>
-      </w:r>
-      <w:r>
-        <w:t>dos</w:t>
-      </w:r>
-      <w:r>
-        <w:t xml:space="preserve"> personas.</w:t>
+        <w:t xml:space="preserve">l </w:t>
+      </w:r>
+      <w:r>
+        <w:t>desarrollo debe incluir</w:t>
+      </w:r>
+      <w:r>
+        <w:t xml:space="preserve"> </w:t>
+      </w:r>
+      <w:r>
+        <w:t>p</w:t>
+      </w:r>
+      <w:r>
+        <w:t xml:space="preserve">atrones de </w:t>
+      </w:r>
+      <w:r>
+        <w:t>d</w:t>
+      </w:r>
+      <w:r>
+        <w:t xml:space="preserve">iseño vistos </w:t>
+      </w:r>
+      <w:r>
+        <w:t>en clase</w:t>
+      </w:r>
+      <w:r>
+        <w:t>.</w:t>
+      </w:r>
+    </w:p>
+    <w:p>
+      <w:pPr>
+        <w:pStyle w:val="ListParagraph"/>
+        <w:numPr>
+          <w:ilvl w:val="0"/>
+          <w:numId w:val="24"/>
+        </w:numPr>
+      </w:pPr>
+      <w:r>
+        <w:t xml:space="preserve">RNF07 - Documentación </w:t>
+      </w:r>
+      <w:r>
+        <w:t>t</w:t>
+      </w:r>
+      <w:r>
+        <w:t xml:space="preserve">écnica: </w:t>
+      </w:r>
+      <w:r>
+        <w:t>s</w:t>
+      </w:r>
+      <w:r>
+        <w:t>e requiere la entrega de diagramas de casos de uso, secuencia/colaboración, diagramas de clases y prototipo de interfaz.</w:t>
+      </w:r>
+    </w:p>
+    <w:p>
+      <w:pPr>
+        <w:pStyle w:val="ListParagraph"/>
+        <w:numPr>
+          <w:ilvl w:val="0"/>
+          <w:numId w:val="24"/>
+        </w:numPr>
+      </w:pPr>
+      <w:r>
+        <w:t xml:space="preserve">RNF08 - </w:t>
+      </w:r>
+      <w:r>
+        <w:t>Entrega</w:t>
+      </w:r>
+      <w:r>
+        <w:t xml:space="preserve"> del </w:t>
+      </w:r>
+      <w:r>
+        <w:t>programa</w:t>
+      </w:r>
+      <w:r>
+        <w:t xml:space="preserve">: </w:t>
+      </w:r>
+      <w:r>
+        <w:t>debe entregarse el programa ejecutable y los códigos fuentes del sistema.</w:t>
       </w:r>
     </w:p>
     <w:sectPr>
@@ -5648,28 +5702,28 @@
 </file>
 
 <file path=customXml/item1.xml><?xml version="1.0" encoding="utf-8"?>
+<b:Sources xmlns:b="http://schemas.openxmlformats.org/officeDocument/2006/bibliography" xmlns="http://schemas.openxmlformats.org/officeDocument/2006/bibliography" SelectedStyle="\APASixthEditionOfficeOnline.xsl" StyleName="APA" Version="6"/>
+</file>
+
+<file path=customXml/item2.xml><?xml version="1.0" encoding="utf-8"?>
 <go:gDocsCustomXmlDataStorage xmlns:go="http://customooxmlschemas.google.com/" xmlns:r="http://schemas.openxmlformats.org/officeDocument/2006/relationships" uri="GoogleDocsCustomDataVersion2">
   <go:docsCustomData xmlns:go="http://customooxmlschemas.google.com/" roundtripDataSignature="AMtx7mizGexCOIC7/NtQ4c+I1nJn5NLzFw==">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</go:docsCustomData>
 </go:gDocsCustomXmlDataStorage>
 </file>
 
-<file path=customXml/item2.xml><?xml version="1.0" encoding="utf-8"?>
-<b:Sources xmlns:b="http://schemas.openxmlformats.org/officeDocument/2006/bibliography" xmlns="http://schemas.openxmlformats.org/officeDocument/2006/bibliography" SelectedStyle="\APASixthEditionOfficeOnline.xsl" StyleName="APA" Version="6"/>
+<file path=customXml/itemProps1.xml><?xml version="1.0" encoding="utf-8"?>
+<ds:datastoreItem xmlns:ds="http://schemas.openxmlformats.org/officeDocument/2006/customXml" ds:itemID="{A959B552-8D78-43F1-8486-B90E55463D4E}">
+  <ds:schemaRefs>
+    <ds:schemaRef ds:uri="http://schemas.openxmlformats.org/officeDocument/2006/bibliography"/>
+  </ds:schemaRefs>
+</ds:datastoreItem>
 </file>
 
-<file path=customXml/itemProps1.xml><?xml version="1.0" encoding="utf-8"?>
+<file path=customXml/itemProps2.xml><?xml version="1.0" encoding="utf-8"?>
 <ds:datastoreItem xmlns:ds="http://schemas.openxmlformats.org/officeDocument/2006/customXml" ds:itemID="{11111111-1234-1234-1234-123412341234}">
   <ds:schemaRefs>
     <ds:schemaRef ds:uri="http://customooxmlschemas.google.com/"/>
     <ds:schemaRef ds:uri="http://schemas.openxmlformats.org/officeDocument/2006/relationships"/>
   </ds:schemaRefs>
 </ds:datastoreItem>
-</file>
-
-<file path=customXml/itemProps2.xml><?xml version="1.0" encoding="utf-8"?>
-<ds:datastoreItem xmlns:ds="http://schemas.openxmlformats.org/officeDocument/2006/customXml" ds:itemID="{A959B552-8D78-43F1-8486-B90E55463D4E}">
-  <ds:schemaRefs>
-    <ds:schemaRef ds:uri="http://schemas.openxmlformats.org/officeDocument/2006/bibliography"/>
-  </ds:schemaRefs>
-</ds:datastoreItem>
 </file>
</xml_diff>